<commit_message>
Remove the prior-review disclosure from the cover letter
Dropped the paragraph beginning "An earlier version of this work ... was
reviewed elsewhere and not accepted". The letter no longer mentions the
previous submission, its reviews, or the offer to supply them. 770 -> 674
words.

Synced the submission ops sheet, which carried the old undecided state:
section 1 told the author to decide whether to keep the paragraph before
uploading (now a date reminder), and section 5 recorded the decision as
"keep" (now "removed", with a note that an Editorial Manager question
about prior submission should still be answered honestly if asked).

The manuscript itself never mentioned the prior submission, and the IiI
upload list does not include the previous response letter, so nothing
else changed.

Co-Authored-By: Claude Opus 5 <noreply@anthropic.com>
Claude-Session: https://claude.ai/code/session_013TkounLTBFVQRstE3VnhkM
</commit_message>
<xml_diff>
--- a/CoverLetter_InsightsIntoImaging.docx
+++ b/CoverLetter_InsightsIntoImaging.docx
@@ -151,14 +151,6 @@
       </w:pPr>
       <w:r>
         <w:t>The complete text-classification rule set, the report-content audit patterns, the between-modality models and the subgroup analyses are provided as three Online Resources, so that the method can be replicated wherever routine reports are stored electronically.</w:t>
-      </w:r>
-    </w:p>
-    <w:p>
-      <w:pPr>
-        <w:spacing w:after="160"/>
-      </w:pPr>
-      <w:r>
-        <w:t>An earlier version of this work, framed as a comparison of diagnostic performance between the three modalities, was reviewed elsewhere and not accepted. The reviewers' central objection was that a case-only cohort with three different, indication-selected denominators cannot support a comparative accuracy claim. We accept that objection. The present manuscript is a different study rather than a revision of that one: the research question, the primary analyses and the conclusions have been rebuilt around what the reports document. We would be glad to supply the earlier reviews and our point-by-point response if that would be useful.</w:t>
       </w:r>
     </w:p>
     <w:p>

</xml_diff>